<commit_message>
Technical Change: latest dashboard updates and refreshed Word reference (v1.1)
Co-Authored-By: Claude Sonnet 5.5 <noreply@anthropic.com>
</commit_message>
<xml_diff>
--- a/Technical_Change_Dashboards_Reference_v1.1.docx
+++ b/Technical_Change_Dashboards_Reference_v1.1.docx
@@ -17072,7 +17072,7 @@
                 <w:szCs w:val="18"/>
                 <w:rFonts w:ascii="Calibri" w:cs="Calibri" w:eastAsia="Calibri" w:hAnsi="Calibri"/>
               </w:rPr>
-              <w:t xml:space="preserve">Hover a project row for a card: savings, additional cost, net and one-time tooling of its approved and implemented changes; the in-effect and awaiting-implementation split; its share of all savings and all additional cost; the forecast (not in the bars); and its three largest contributing changes.</w:t>
+              <w:t xml:space="preserve">Hover a project row for a small card with its additional cost, savings and net impact.</w:t>
             </w:r>
           </w:p>
         </w:tc>
@@ -25372,7 +25372,7 @@
                 <w:szCs w:val="18"/>
                 <w:rFonts w:ascii="Calibri" w:cs="Calibri" w:eastAsia="Calibri" w:hAnsi="Calibri"/>
               </w:rPr>
-              <w:t xml:space="preserve">Change Impact — Net impact by project: hover card per project (section 5.2). Revision history added.</w:t>
+              <w:t xml:space="preserve">Change Impact — Net impact by project: hover card per project showing additional cost, savings and net (section 5.2). Revision history added.</w:t>
             </w:r>
           </w:p>
         </w:tc>

</xml_diff>